<commit_message>
SG3: Artifacts final update (hopefully)
</commit_message>
<xml_diff>
--- a/SG3_Devices/SG3_Artifacts/SG3_TestPlan.docx
+++ b/SG3_Devices/SG3_Artifacts/SG3_TestPlan.docx
@@ -99,7 +99,7 @@
     </w:p>
     <w:sdt>
       <w:sdtPr>
-        <w:id w:val="5090812"/>
+        <w:id w:val="1278026971"/>
         <w:docPartObj>
           <w:docPartGallery w:val="Table of Contents"/>
           <w:docPartUnique w:val="1"/>
@@ -1070,6 +1070,12 @@
               <w:rPr>
                 <w:rtl w:val="0"/>
               </w:rPr>
+              <w:t xml:space="preserve">08/May/26</w:t>
+            </w:r>
+            <w:r>
+              <w:rPr>
+                <w:rtl w:val="0"/>
+              </w:rPr>
             </w:r>
           </w:p>
         </w:tc>
@@ -1114,6 +1120,12 @@
               <w:rPr>
                 <w:rtl w:val="0"/>
               </w:rPr>
+              <w:t xml:space="preserve">1.2</w:t>
+            </w:r>
+            <w:r>
+              <w:rPr>
+                <w:rtl w:val="0"/>
+              </w:rPr>
             </w:r>
           </w:p>
         </w:tc>
@@ -1158,6 +1170,12 @@
               <w:rPr>
                 <w:rtl w:val="0"/>
               </w:rPr>
+              <w:t xml:space="preserve">Added PlatformIO native unit testing setup and Unity framework configuration. </w:t>
+            </w:r>
+            <w:r>
+              <w:rPr>
+                <w:rtl w:val="0"/>
+              </w:rPr>
             </w:r>
           </w:p>
         </w:tc>
@@ -1182,26 +1200,65 @@
               <w:spacing w:after="120" w:before="0" w:line="240" w:lineRule="auto"/>
               <w:ind w:left="0" w:right="0" w:firstLine="0"/>
               <w:jc w:val="left"/>
-              <w:rPr>
-                <w:rFonts w:ascii="Times New Roman" w:cs="Times New Roman" w:eastAsia="Times New Roman" w:hAnsi="Times New Roman"/>
-                <w:b w:val="0"/>
-                <w:bCs w:val="0"/>
-                <w:i w:val="0"/>
-                <w:iCs w:val="0"/>
-                <w:smallCaps w:val="0"/>
-                <w:strike w:val="0"/>
-                <w:color w:val="000000"/>
-                <w:sz w:val="20"/>
-                <w:szCs w:val="20"/>
-                <w:u w:val="none"/>
-                <w:shd w:fill="auto" w:val="clear"/>
-                <w:vertAlign w:val="baseline"/>
-              </w:rPr>
+              <w:rPr/>
             </w:pPr>
             <w:r>
               <w:rPr>
                 <w:rtl w:val="0"/>
               </w:rPr>
+              <w:t xml:space="preserve">Sergej Macut</w:t>
+            </w:r>
+          </w:p>
+          <w:p>
+            <w:pPr>
+              <w:keepNext w:val="0"/>
+              <w:keepLines w:val="1"/>
+              <w:pageBreakBefore w:val="0"/>
+              <w:widowControl w:val="0"/>
+              <w:pBdr>
+                <w:top w:space="0" w:sz="0" w:val="nil"/>
+                <w:left w:space="0" w:sz="0" w:val="nil"/>
+                <w:bottom w:space="0" w:sz="0" w:val="nil"/>
+                <w:right w:space="0" w:sz="0" w:val="nil"/>
+                <w:between w:space="0" w:sz="0" w:val="nil"/>
+              </w:pBdr>
+              <w:shd w:fill="auto" w:val="clear"/>
+              <w:spacing w:after="120" w:before="0" w:line="240" w:lineRule="auto"/>
+              <w:ind w:left="0" w:right="0" w:firstLine="0"/>
+              <w:jc w:val="left"/>
+              <w:rPr/>
+            </w:pPr>
+            <w:r>
+              <w:rPr>
+                <w:rtl w:val="0"/>
+              </w:rPr>
+              <w:t xml:space="preserve">Ryad Hazin</w:t>
+            </w:r>
+          </w:p>
+          <w:p>
+            <w:pPr>
+              <w:keepNext w:val="0"/>
+              <w:keepLines w:val="1"/>
+              <w:pageBreakBefore w:val="0"/>
+              <w:widowControl w:val="0"/>
+              <w:pBdr>
+                <w:top w:space="0" w:sz="0" w:val="nil"/>
+                <w:left w:space="0" w:sz="0" w:val="nil"/>
+                <w:bottom w:space="0" w:sz="0" w:val="nil"/>
+                <w:right w:space="0" w:sz="0" w:val="nil"/>
+                <w:between w:space="0" w:sz="0" w:val="nil"/>
+              </w:pBdr>
+              <w:shd w:fill="auto" w:val="clear"/>
+              <w:spacing w:after="120" w:before="0" w:line="240" w:lineRule="auto"/>
+              <w:ind w:left="0" w:right="0" w:firstLine="0"/>
+              <w:jc w:val="left"/>
+              <w:rPr/>
+            </w:pPr>
+            <w:r>
+              <w:rPr>
+                <w:rtl w:val="0"/>
+              </w:rPr>
+              <w:t xml:space="preserve">Tony Nguyen</w:t>
             </w:r>
           </w:p>
         </w:tc>
@@ -1252,6 +1309,12 @@
               <w:rPr>
                 <w:rtl w:val="0"/>
               </w:rPr>
+              <w:t xml:space="preserve">08/May/26</w:t>
+            </w:r>
+            <w:r>
+              <w:rPr>
+                <w:rtl w:val="0"/>
+              </w:rPr>
             </w:r>
           </w:p>
         </w:tc>
@@ -1296,6 +1359,12 @@
               <w:rPr>
                 <w:rtl w:val="0"/>
               </w:rPr>
+              <w:t xml:space="preserve">1.3</w:t>
+            </w:r>
+            <w:r>
+              <w:rPr>
+                <w:rtl w:val="0"/>
+              </w:rPr>
             </w:r>
           </w:p>
         </w:tc>
@@ -1340,6 +1409,12 @@
               <w:rPr>
                 <w:rtl w:val="0"/>
               </w:rPr>
+              <w:t xml:space="preserve">Added device unit tests for BuzzerDevice, Fan, DoorDevice, and WindowDevice. </w:t>
+            </w:r>
+            <w:r>
+              <w:rPr>
+                <w:rtl w:val="0"/>
+              </w:rPr>
             </w:r>
           </w:p>
         </w:tc>
@@ -1384,6 +1459,12 @@
               <w:rPr>
                 <w:rtl w:val="0"/>
               </w:rPr>
+              <w:t xml:space="preserve">Mustafa Al-Bayati</w:t>
+            </w:r>
+            <w:r>
+              <w:rPr>
+                <w:rtl w:val="0"/>
+              </w:rPr>
             </w:r>
           </w:p>
         </w:tc>
@@ -1596,7 +1677,6 @@
       <w:r>
         <w:rPr>
           <w:rFonts w:ascii="Roboto Mono" w:cs="Roboto Mono" w:eastAsia="Roboto Mono" w:hAnsi="Roboto Mono"/>
-          <w:color w:val="188038"/>
           <w:sz w:val="24"/>
           <w:szCs w:val="24"/>
           <w:rtl w:val="0"/>
@@ -1614,7 +1694,6 @@
       <w:r>
         <w:rPr>
           <w:rFonts w:ascii="Roboto Mono" w:cs="Roboto Mono" w:eastAsia="Roboto Mono" w:hAnsi="Roboto Mono"/>
-          <w:color w:val="188038"/>
           <w:sz w:val="24"/>
           <w:szCs w:val="24"/>
           <w:rtl w:val="0"/>
@@ -1632,7 +1711,6 @@
       <w:r>
         <w:rPr>
           <w:rFonts w:ascii="Roboto Mono" w:cs="Roboto Mono" w:eastAsia="Roboto Mono" w:hAnsi="Roboto Mono"/>
-          <w:color w:val="188038"/>
           <w:sz w:val="24"/>
           <w:szCs w:val="24"/>
           <w:rtl w:val="0"/>
@@ -1650,7 +1728,6 @@
       <w:r>
         <w:rPr>
           <w:rFonts w:ascii="Roboto Mono" w:cs="Roboto Mono" w:eastAsia="Roboto Mono" w:hAnsi="Roboto Mono"/>
-          <w:color w:val="188038"/>
           <w:sz w:val="24"/>
           <w:szCs w:val="24"/>
           <w:rtl w:val="0"/>
@@ -1668,7 +1745,6 @@
       <w:r>
         <w:rPr>
           <w:rFonts w:ascii="Roboto Mono" w:cs="Roboto Mono" w:eastAsia="Roboto Mono" w:hAnsi="Roboto Mono"/>
-          <w:color w:val="188038"/>
           <w:sz w:val="24"/>
           <w:szCs w:val="24"/>
           <w:rtl w:val="0"/>
@@ -1686,7 +1762,6 @@
       <w:r>
         <w:rPr>
           <w:rFonts w:ascii="Roboto Mono" w:cs="Roboto Mono" w:eastAsia="Roboto Mono" w:hAnsi="Roboto Mono"/>
-          <w:color w:val="188038"/>
           <w:sz w:val="24"/>
           <w:szCs w:val="24"/>
           <w:rtl w:val="0"/>
@@ -1704,7 +1779,6 @@
       <w:r>
         <w:rPr>
           <w:rFonts w:ascii="Roboto Mono" w:cs="Roboto Mono" w:eastAsia="Roboto Mono" w:hAnsi="Roboto Mono"/>
-          <w:color w:val="188038"/>
           <w:sz w:val="24"/>
           <w:szCs w:val="24"/>
           <w:rtl w:val="0"/>
@@ -1722,7 +1796,6 @@
       <w:r>
         <w:rPr>
           <w:rFonts w:ascii="Roboto Mono" w:cs="Roboto Mono" w:eastAsia="Roboto Mono" w:hAnsi="Roboto Mono"/>
-          <w:color w:val="188038"/>
           <w:sz w:val="24"/>
           <w:szCs w:val="24"/>
           <w:rtl w:val="0"/>
@@ -1740,7 +1813,6 @@
       <w:r>
         <w:rPr>
           <w:rFonts w:ascii="Roboto Mono" w:cs="Roboto Mono" w:eastAsia="Roboto Mono" w:hAnsi="Roboto Mono"/>
-          <w:color w:val="188038"/>
           <w:sz w:val="24"/>
           <w:szCs w:val="24"/>
           <w:rtl w:val="0"/>
@@ -1758,7 +1830,6 @@
       <w:r>
         <w:rPr>
           <w:rFonts w:ascii="Roboto Mono" w:cs="Roboto Mono" w:eastAsia="Roboto Mono" w:hAnsi="Roboto Mono"/>
-          <w:color w:val="188038"/>
           <w:sz w:val="24"/>
           <w:szCs w:val="24"/>
           <w:rtl w:val="0"/>
@@ -1776,7 +1847,6 @@
       <w:r>
         <w:rPr>
           <w:rFonts w:ascii="Roboto Mono" w:cs="Roboto Mono" w:eastAsia="Roboto Mono" w:hAnsi="Roboto Mono"/>
-          <w:color w:val="188038"/>
           <w:sz w:val="24"/>
           <w:szCs w:val="24"/>
           <w:rtl w:val="0"/>
@@ -1839,7 +1909,6 @@
       <w:r>
         <w:rPr>
           <w:rFonts w:ascii="Roboto Mono" w:cs="Roboto Mono" w:eastAsia="Roboto Mono" w:hAnsi="Roboto Mono"/>
-          <w:color w:val="188038"/>
           <w:sz w:val="24"/>
           <w:szCs w:val="24"/>
           <w:rtl w:val="0"/>
@@ -1857,7 +1926,6 @@
       <w:r>
         <w:rPr>
           <w:rFonts w:ascii="Roboto Mono" w:cs="Roboto Mono" w:eastAsia="Roboto Mono" w:hAnsi="Roboto Mono"/>
-          <w:color w:val="188038"/>
           <w:sz w:val="24"/>
           <w:szCs w:val="24"/>
           <w:rtl w:val="0"/>
@@ -1875,7 +1943,6 @@
       <w:r>
         <w:rPr>
           <w:rFonts w:ascii="Roboto Mono" w:cs="Roboto Mono" w:eastAsia="Roboto Mono" w:hAnsi="Roboto Mono"/>
-          <w:color w:val="188038"/>
           <w:sz w:val="24"/>
           <w:szCs w:val="24"/>
           <w:rtl w:val="0"/>
@@ -1893,7 +1960,6 @@
       <w:r>
         <w:rPr>
           <w:rFonts w:ascii="Roboto Mono" w:cs="Roboto Mono" w:eastAsia="Roboto Mono" w:hAnsi="Roboto Mono"/>
-          <w:color w:val="188038"/>
           <w:sz w:val="24"/>
           <w:szCs w:val="24"/>
           <w:rtl w:val="0"/>
@@ -1911,7 +1977,6 @@
       <w:r>
         <w:rPr>
           <w:rFonts w:ascii="Roboto Mono" w:cs="Roboto Mono" w:eastAsia="Roboto Mono" w:hAnsi="Roboto Mono"/>
-          <w:color w:val="188038"/>
           <w:sz w:val="24"/>
           <w:szCs w:val="24"/>
           <w:rtl w:val="0"/>
@@ -1929,7 +1994,6 @@
       <w:r>
         <w:rPr>
           <w:rFonts w:ascii="Roboto Mono" w:cs="Roboto Mono" w:eastAsia="Roboto Mono" w:hAnsi="Roboto Mono"/>
-          <w:color w:val="188038"/>
           <w:sz w:val="24"/>
           <w:szCs w:val="24"/>
           <w:rtl w:val="0"/>
@@ -1942,7 +2006,7 @@
           <w:szCs w:val="24"/>
           <w:rtl w:val="0"/>
         </w:rPr>
-        <w:t xml:space="preserve"> figure[4]. </w:t>
+        <w:t xml:space="preserve"> Figure[4] and [5]. </w:t>
       </w:r>
       <w:r>
         <w:rPr>
@@ -1997,7 +2061,6 @@
       <w:r>
         <w:rPr>
           <w:rFonts w:ascii="Roboto Mono" w:cs="Roboto Mono" w:eastAsia="Roboto Mono" w:hAnsi="Roboto Mono"/>
-          <w:color w:val="188038"/>
           <w:sz w:val="24"/>
           <w:szCs w:val="24"/>
           <w:rtl w:val="0"/>
@@ -2015,7 +2078,6 @@
       <w:r>
         <w:rPr>
           <w:rFonts w:ascii="Roboto Mono" w:cs="Roboto Mono" w:eastAsia="Roboto Mono" w:hAnsi="Roboto Mono"/>
-          <w:color w:val="188038"/>
           <w:sz w:val="24"/>
           <w:szCs w:val="24"/>
           <w:rtl w:val="0"/>
@@ -2033,7 +2095,6 @@
       <w:r>
         <w:rPr>
           <w:rFonts w:ascii="Roboto Mono" w:cs="Roboto Mono" w:eastAsia="Roboto Mono" w:hAnsi="Roboto Mono"/>
-          <w:color w:val="188038"/>
           <w:sz w:val="24"/>
           <w:szCs w:val="24"/>
           <w:rtl w:val="0"/>
@@ -2051,7 +2112,6 @@
       <w:r>
         <w:rPr>
           <w:rFonts w:ascii="Roboto Mono" w:cs="Roboto Mono" w:eastAsia="Roboto Mono" w:hAnsi="Roboto Mono"/>
-          <w:color w:val="188038"/>
           <w:sz w:val="24"/>
           <w:szCs w:val="24"/>
           <w:rtl w:val="0"/>
@@ -2069,7 +2129,6 @@
       <w:r>
         <w:rPr>
           <w:rFonts w:ascii="Roboto Mono" w:cs="Roboto Mono" w:eastAsia="Roboto Mono" w:hAnsi="Roboto Mono"/>
-          <w:color w:val="188038"/>
           <w:sz w:val="24"/>
           <w:szCs w:val="24"/>
           <w:rtl w:val="0"/>
@@ -2087,7 +2146,6 @@
       <w:r>
         <w:rPr>
           <w:rFonts w:ascii="Roboto Mono" w:cs="Roboto Mono" w:eastAsia="Roboto Mono" w:hAnsi="Roboto Mono"/>
-          <w:color w:val="188038"/>
           <w:sz w:val="24"/>
           <w:szCs w:val="24"/>
           <w:rtl w:val="0"/>
@@ -2105,7 +2163,6 @@
       <w:r>
         <w:rPr>
           <w:rFonts w:ascii="Roboto Mono" w:cs="Roboto Mono" w:eastAsia="Roboto Mono" w:hAnsi="Roboto Mono"/>
-          <w:color w:val="188038"/>
           <w:sz w:val="24"/>
           <w:szCs w:val="24"/>
           <w:rtl w:val="0"/>
@@ -2123,7 +2180,6 @@
       <w:r>
         <w:rPr>
           <w:rFonts w:ascii="Roboto Mono" w:cs="Roboto Mono" w:eastAsia="Roboto Mono" w:hAnsi="Roboto Mono"/>
-          <w:color w:val="188038"/>
           <w:sz w:val="24"/>
           <w:szCs w:val="24"/>
           <w:rtl w:val="0"/>
@@ -2141,7 +2197,6 @@
       <w:r>
         <w:rPr>
           <w:rFonts w:ascii="Roboto Mono" w:cs="Roboto Mono" w:eastAsia="Roboto Mono" w:hAnsi="Roboto Mono"/>
-          <w:color w:val="188038"/>
           <w:sz w:val="24"/>
           <w:szCs w:val="24"/>
           <w:rtl w:val="0"/>
@@ -2204,7 +2259,6 @@
       <w:r>
         <w:rPr>
           <w:rFonts w:ascii="Roboto Mono" w:cs="Roboto Mono" w:eastAsia="Roboto Mono" w:hAnsi="Roboto Mono"/>
-          <w:color w:val="188038"/>
           <w:sz w:val="24"/>
           <w:szCs w:val="24"/>
           <w:rtl w:val="0"/>
@@ -2222,7 +2276,6 @@
       <w:r>
         <w:rPr>
           <w:rFonts w:ascii="Roboto Mono" w:cs="Roboto Mono" w:eastAsia="Roboto Mono" w:hAnsi="Roboto Mono"/>
-          <w:color w:val="188038"/>
           <w:sz w:val="24"/>
           <w:szCs w:val="24"/>
           <w:rtl w:val="0"/>
@@ -2240,7 +2293,6 @@
       <w:r>
         <w:rPr>
           <w:rFonts w:ascii="Roboto Mono" w:cs="Roboto Mono" w:eastAsia="Roboto Mono" w:hAnsi="Roboto Mono"/>
-          <w:color w:val="188038"/>
           <w:sz w:val="24"/>
           <w:szCs w:val="24"/>
           <w:rtl w:val="0"/>
@@ -2258,7 +2310,6 @@
       <w:r>
         <w:rPr>
           <w:rFonts w:ascii="Roboto Mono" w:cs="Roboto Mono" w:eastAsia="Roboto Mono" w:hAnsi="Roboto Mono"/>
-          <w:color w:val="188038"/>
           <w:sz w:val="24"/>
           <w:szCs w:val="24"/>
           <w:rtl w:val="0"/>
@@ -2466,12 +2517,12 @@
           <wp:inline distB="114300" distT="114300" distL="114300" distR="114300">
             <wp:extent cx="5943600" cy="774700"/>
             <wp:effectExtent b="0" l="0" r="0" t="0"/>
-            <wp:docPr id="1" name="image4.png"/>
+            <wp:docPr id="1" name="image1.png"/>
             <a:graphic>
               <a:graphicData uri="http://schemas.openxmlformats.org/drawingml/2006/picture">
                 <pic:pic>
                   <pic:nvPicPr>
-                    <pic:cNvPr id="0" name="image4.png"/>
+                    <pic:cNvPr id="0" name="image1.png"/>
                     <pic:cNvPicPr preferRelativeResize="0"/>
                   </pic:nvPicPr>
                   <pic:blipFill>
@@ -2562,12 +2613,12 @@
           <wp:inline distB="114300" distT="114300" distL="114300" distR="114300">
             <wp:extent cx="5943600" cy="558800"/>
             <wp:effectExtent b="0" l="0" r="0" t="0"/>
-            <wp:docPr id="2" name="image1.png"/>
+            <wp:docPr id="4" name="image5.png"/>
             <a:graphic>
               <a:graphicData uri="http://schemas.openxmlformats.org/drawingml/2006/picture">
                 <pic:pic>
                   <pic:nvPicPr>
-                    <pic:cNvPr id="0" name="image1.png"/>
+                    <pic:cNvPr id="0" name="image5.png"/>
                     <pic:cNvPicPr preferRelativeResize="0"/>
                   </pic:nvPicPr>
                   <pic:blipFill>
@@ -2645,12 +2696,12 @@
           <wp:inline distB="114300" distT="114300" distL="114300" distR="114300">
             <wp:extent cx="5943600" cy="1752600"/>
             <wp:effectExtent b="0" l="0" r="0" t="0"/>
-            <wp:docPr id="3" name="image3.png"/>
+            <wp:docPr id="5" name="image2.png"/>
             <a:graphic>
               <a:graphicData uri="http://schemas.openxmlformats.org/drawingml/2006/picture">
                 <pic:pic>
                   <pic:nvPicPr>
-                    <pic:cNvPr id="0" name="image3.png"/>
+                    <pic:cNvPr id="0" name="image2.png"/>
                     <pic:cNvPicPr preferRelativeResize="0"/>
                   </pic:nvPicPr>
                   <pic:blipFill>
@@ -2707,6 +2758,89 @@
       </w:pPr>
       <w:r>
         <w:rPr>
+          <w:rtl w:val="0"/>
+        </w:rPr>
+      </w:r>
+    </w:p>
+    <w:p>
+      <w:pPr>
+        <w:jc w:val="center"/>
+        <w:rPr>
+          <w:i w:val="1"/>
+          <w:iCs w:val="1"/>
+        </w:rPr>
+      </w:pPr>
+      <w:r>
+        <w:rPr>
+          <w:i w:val="1"/>
+          <w:iCs w:val="1"/>
+        </w:rPr>
+        <w:drawing>
+          <wp:inline distB="114300" distT="114300" distL="114300" distR="114300">
+            <wp:extent cx="5943600" cy="2286000"/>
+            <wp:effectExtent b="0" l="0" r="0" t="0"/>
+            <wp:docPr id="2" name="image3.png"/>
+            <a:graphic>
+              <a:graphicData uri="http://schemas.openxmlformats.org/drawingml/2006/picture">
+                <pic:pic>
+                  <pic:nvPicPr>
+                    <pic:cNvPr id="0" name="image3.png"/>
+                    <pic:cNvPicPr preferRelativeResize="0"/>
+                  </pic:nvPicPr>
+                  <pic:blipFill>
+                    <a:blip r:embed="rId16"/>
+                    <a:srcRect b="0" l="0" r="0" t="0"/>
+                    <a:stretch>
+                      <a:fillRect/>
+                    </a:stretch>
+                  </pic:blipFill>
+                  <pic:spPr>
+                    <a:xfrm>
+                      <a:off x="0" y="0"/>
+                      <a:ext cx="5943600" cy="2286000"/>
+                    </a:xfrm>
+                    <a:prstGeom prst="rect"/>
+                    <a:ln/>
+                  </pic:spPr>
+                </pic:pic>
+              </a:graphicData>
+            </a:graphic>
+          </wp:inline>
+        </w:drawing>
+      </w:r>
+      <w:r>
+        <w:rPr>
+          <w:rtl w:val="0"/>
+        </w:rPr>
+      </w:r>
+    </w:p>
+    <w:p>
+      <w:pPr>
+        <w:jc w:val="center"/>
+        <w:rPr>
+          <w:i w:val="1"/>
+          <w:iCs w:val="1"/>
+        </w:rPr>
+      </w:pPr>
+      <w:r>
+        <w:rPr>
+          <w:i w:val="1"/>
+          <w:iCs w:val="1"/>
+          <w:rtl w:val="0"/>
+        </w:rPr>
+        <w:t xml:space="preserve">Figure 5; Buzzer, Door, Fan and Window</w:t>
+      </w:r>
+    </w:p>
+    <w:p>
+      <w:pPr>
+        <w:jc w:val="center"/>
+        <w:rPr>
+          <w:i w:val="1"/>
+          <w:iCs w:val="1"/>
+        </w:rPr>
+      </w:pPr>
+      <w:r>
+        <w:rPr>
           <w:i w:val="1"/>
           <w:iCs w:val="1"/>
         </w:rPr>
@@ -2714,16 +2848,16 @@
           <wp:inline distB="114300" distT="114300" distL="114300" distR="114300">
             <wp:extent cx="5943600" cy="5168900"/>
             <wp:effectExtent b="0" l="0" r="0" t="0"/>
-            <wp:docPr id="4" name="image2.png"/>
+            <wp:docPr id="6" name="image4.png"/>
             <a:graphic>
               <a:graphicData uri="http://schemas.openxmlformats.org/drawingml/2006/picture">
                 <pic:pic>
                   <pic:nvPicPr>
-                    <pic:cNvPr id="0" name="image2.png"/>
+                    <pic:cNvPr id="0" name="image4.png"/>
                     <pic:cNvPicPr preferRelativeResize="0"/>
                   </pic:nvPicPr>
                   <pic:blipFill>
-                    <a:blip r:embed="rId16"/>
+                    <a:blip r:embed="rId17"/>
                     <a:srcRect b="0" l="0" r="0" t="0"/>
                     <a:stretch>
                       <a:fillRect/>
@@ -2749,11 +2883,94 @@
         </w:rPr>
       </w:r>
     </w:p>
+    <w:p>
+      <w:pPr>
+        <w:jc w:val="left"/>
+        <w:rPr>
+          <w:i w:val="1"/>
+          <w:iCs w:val="1"/>
+        </w:rPr>
+      </w:pPr>
+      <w:r>
+        <w:rPr>
+          <w:rtl w:val="0"/>
+        </w:rPr>
+      </w:r>
+    </w:p>
+    <w:p>
+      <w:pPr>
+        <w:jc w:val="center"/>
+        <w:rPr>
+          <w:i w:val="1"/>
+          <w:iCs w:val="1"/>
+        </w:rPr>
+      </w:pPr>
+      <w:r>
+        <w:rPr>
+          <w:i w:val="1"/>
+          <w:iCs w:val="1"/>
+        </w:rPr>
+        <w:drawing>
+          <wp:inline distB="114300" distT="114300" distL="114300" distR="114300">
+            <wp:extent cx="5943600" cy="2590800"/>
+            <wp:effectExtent b="0" l="0" r="0" t="0"/>
+            <wp:docPr id="3" name="image6.png"/>
+            <a:graphic>
+              <a:graphicData uri="http://schemas.openxmlformats.org/drawingml/2006/picture">
+                <pic:pic>
+                  <pic:nvPicPr>
+                    <pic:cNvPr id="0" name="image6.png"/>
+                    <pic:cNvPicPr preferRelativeResize="0"/>
+                  </pic:nvPicPr>
+                  <pic:blipFill>
+                    <a:blip r:embed="rId18"/>
+                    <a:srcRect b="0" l="0" r="0" t="0"/>
+                    <a:stretch>
+                      <a:fillRect/>
+                    </a:stretch>
+                  </pic:blipFill>
+                  <pic:spPr>
+                    <a:xfrm>
+                      <a:off x="0" y="0"/>
+                      <a:ext cx="5943600" cy="2590800"/>
+                    </a:xfrm>
+                    <a:prstGeom prst="rect"/>
+                    <a:ln/>
+                  </pic:spPr>
+                </pic:pic>
+              </a:graphicData>
+            </a:graphic>
+          </wp:inline>
+        </w:drawing>
+      </w:r>
+      <w:r>
+        <w:rPr>
+          <w:rtl w:val="0"/>
+        </w:rPr>
+      </w:r>
+    </w:p>
+    <w:p>
+      <w:pPr>
+        <w:jc w:val="center"/>
+        <w:rPr>
+          <w:i w:val="1"/>
+          <w:iCs w:val="1"/>
+        </w:rPr>
+      </w:pPr>
+      <w:r>
+        <w:rPr>
+          <w:i w:val="1"/>
+          <w:iCs w:val="1"/>
+          <w:rtl w:val="0"/>
+        </w:rPr>
+        <w:t xml:space="preserve">Figure 7.  Gateway test</w:t>
+      </w:r>
+    </w:p>
     <w:sectPr>
-      <w:headerReference r:id="rId17" w:type="default"/>
-      <w:headerReference r:id="rId18" w:type="first"/>
-      <w:footerReference r:id="rId19" w:type="default"/>
-      <w:footerReference r:id="rId20" w:type="first"/>
+      <w:headerReference r:id="rId19" w:type="default"/>
+      <w:headerReference r:id="rId20" w:type="first"/>
+      <w:footerReference r:id="rId21" w:type="default"/>
+      <w:footerReference r:id="rId22" w:type="first"/>
       <w:type w:val="nextPage"/>
       <w:pgSz w:h="15840" w:w="12240" w:orient="portrait"/>
       <w:pgMar w:bottom="1440" w:top="1440" w:left="1440" w:right="1440" w:header="720" w:footer="720"/>

</xml_diff>